<commit_message>
feat(eb09, tema3): publicar materiales tema 3, sesion 09 y simulacro hasta s08
</commit_message>
<xml_diff>
--- a/Temas EB/Tema 3/Lecturas complementarias/Políticas Pasivas de Empleo_ Evidencia y Análisis II.docx
+++ b/Temas EB/Tema 3/Lecturas complementarias/Políticas Pasivas de Empleo_ Evidencia y Análisis II.docx
@@ -4510,6 +4510,243 @@
       <w:pPr>
         <w:jc w:val="both"/>
       </w:pPr>
+    </w:p>
+    <w:p>
+      <w:r>
+        <w:br w:type="page"/>
+      </w:r>
+    </w:p>
+    <w:p>
+      <w:pPr>
+        <w:pStyle w:val="Ttulo1"/>
+      </w:pPr>
+      <w:r>
+        <w:t>REFERENCIAS BIBLIOGRÁFICAS</w:t>
+      </w:r>
+    </w:p>
+    <w:p>
+      <w:pPr>
+        <w:spacing w:after="80"/>
+        <w:ind w:left="360" w:hanging="360"/>
+      </w:pPr>
+      <w:r>
+        <w:t>AIReF (2025). Opinión sobre el Ingreso Mínimo Vital (cuarta opinión). Autoridad Independiente de Responsabilidad Fiscal.</w:t>
+      </w:r>
+    </w:p>
+    <w:p>
+      <w:pPr>
+        <w:spacing w:after="80"/>
+        <w:ind w:left="360" w:hanging="360"/>
+      </w:pPr>
+      <w:r>
+        <w:t>Bentolila, S., García-Pérez, J. I., &amp; Jansen, M. (2017). Are the Spanish long-term unemployed unemployable? SERIEs, 8(1), 1-41.</w:t>
+      </w:r>
+    </w:p>
+    <w:p>
+      <w:pPr>
+        <w:spacing w:after="80"/>
+        <w:ind w:left="360" w:hanging="360"/>
+      </w:pPr>
+      <w:r>
+        <w:t>Chetty, R. (2008). Moral hazard versus liquidity and optimal unemployment insurance. Journal of Political Economy, 116(2), 173-234.</w:t>
+      </w:r>
+    </w:p>
+    <w:p>
+      <w:pPr>
+        <w:spacing w:after="80"/>
+        <w:ind w:left="360" w:hanging="360"/>
+      </w:pPr>
+      <w:r>
+        <w:t>Cohen, J., &amp; Ganong, P. (2024). Disemployment effects of unemployment insurance: A meta-analysis. NBER Working Paper No. 32832.</w:t>
+      </w:r>
+    </w:p>
+    <w:p>
+      <w:pPr>
+        <w:spacing w:after="80"/>
+        <w:ind w:left="360" w:hanging="360"/>
+      </w:pPr>
+      <w:r>
+        <w:t>Di Maggio, M., &amp; Kermani, A. (2016). The importance of unemployment insurance as an automatic stabilizer. NBER Working Paper No. 22625.</w:t>
+      </w:r>
+    </w:p>
+    <w:p>
+      <w:pPr>
+        <w:spacing w:after="80"/>
+        <w:ind w:left="360" w:hanging="360"/>
+      </w:pPr>
+      <w:r>
+        <w:t>Gruber, J. (1997). The consumption smoothing benefits of unemployment insurance. American Economic Review, 87(1), 192-205.</w:t>
+      </w:r>
+    </w:p>
+    <w:p>
+      <w:pPr>
+        <w:spacing w:after="80"/>
+        <w:ind w:left="360" w:hanging="360"/>
+      </w:pPr>
+      <w:r>
+        <w:t>Katz, L. F., &amp; Meyer, B. D. (1990). The impact of the potential duration of unemployment benefits on the duration of unemployment. Journal of Public Economics, 41(1), 45-72.</w:t>
+      </w:r>
+    </w:p>
+    <w:p>
+      <w:pPr>
+        <w:spacing w:after="80"/>
+        <w:ind w:left="360" w:hanging="360"/>
+      </w:pPr>
+      <w:r>
+        <w:t>Kekre, R. (2023). Unemployment insurance in macroeconomic stabilization. Review of Economic Studies.</w:t>
+      </w:r>
+    </w:p>
+    <w:p>
+      <w:pPr>
+        <w:spacing w:after="80"/>
+        <w:ind w:left="360" w:hanging="360"/>
+      </w:pPr>
+      <w:r>
+        <w:t>McCall, J. J. (1970). Economics of information and job search. Quarterly Journal of Economics, 84(1), 113-126.</w:t>
+      </w:r>
+    </w:p>
+    <w:p>
+      <w:pPr>
+        <w:spacing w:after="80"/>
+        <w:ind w:left="360" w:hanging="360"/>
+      </w:pPr>
+      <w:r>
+        <w:t>Mortensen, D. T. (1977). Unemployment insurance and job search decisions. Industrial and Labor Relations Review, 30(4), 505-517.</w:t>
+      </w:r>
+    </w:p>
+    <w:p>
+      <w:pPr>
+        <w:spacing w:after="80"/>
+        <w:ind w:left="360" w:hanging="360"/>
+      </w:pPr>
+      <w:r>
+        <w:t>Nekoei, A., &amp; Weber, A. (2017). Does extending unemployment benefits improve job quality? American Economic Review, 107(2), 527-561.</w:t>
+      </w:r>
+    </w:p>
+    <w:p>
+      <w:pPr>
+        <w:spacing w:after="80"/>
+        <w:ind w:left="360" w:hanging="360"/>
+      </w:pPr>
+      <w:r>
+        <w:t>Rebollo-Sanz, Y. (2012). Unemployment insurance and job turnover in Spain. Labour Economics, 19(3), 403-426.</w:t>
+      </w:r>
+    </w:p>
+    <w:p>
+      <w:pPr>
+        <w:spacing w:after="80"/>
+        <w:ind w:left="360" w:hanging="360"/>
+      </w:pPr>
+      <w:r>
+        <w:t>Rebollo-Sanz, Y., &amp; Rodríguez-Planas, N. (2020). When the going gets tough... Financial incentives, duration of unemployment and job-match quality. Journal of Human Resources, 55(1), 119-161.</w:t>
+      </w:r>
+    </w:p>
+    <w:p>
+      <w:pPr>
+        <w:spacing w:after="80"/>
+        <w:ind w:left="360" w:hanging="360"/>
+      </w:pPr>
+      <w:r>
+        <w:t>Schmieder, J. F., von Wachter, T., &amp; Bender, S. (2012). The effects of extended unemployment insurance over the business cycle: Evidence from regression discontinuity estimates over 20 years. Quarterly Journal of Economics, 127(2), 701-752.</w:t>
+      </w:r>
+    </w:p>
+    <w:p>
+      <w:pPr>
+        <w:spacing w:after="80"/>
+        <w:ind w:left="360" w:hanging="360"/>
+      </w:pPr>
+      <w:r>
+        <w:t>Schmieder, J. F., von Wachter, T., &amp; Bender, S. (2016). The effect of unemployment benefits and nonemployment durations on wages. American Economic Review, 106(3), 739-777.</w:t>
+      </w:r>
+    </w:p>
+    <w:p>
+      <w:pPr>
+        <w:pStyle w:val="Ttulo2"/>
+      </w:pPr>
+      <w:r>
+        <w:t>Normativa y documentos oficiales</w:t>
+      </w:r>
+    </w:p>
+    <w:p>
+      <w:pPr>
+        <w:spacing w:after="80"/>
+        <w:ind w:left="360" w:hanging="360"/>
+      </w:pPr>
+      <w:r>
+        <w:t>Real Decreto Legislativo 8/2015, de 30 de octubre, por el que se aprueba el texto refundido de la Ley General de la Seguridad Social (título III, protección por desempleo).</w:t>
+      </w:r>
+    </w:p>
+    <w:p>
+      <w:pPr>
+        <w:spacing w:after="80"/>
+        <w:ind w:left="360" w:hanging="360"/>
+      </w:pPr>
+      <w:r>
+        <w:t>Real Decreto-ley 20/2020, de 29 de mayo, por el que se establece el ingreso mínimo vital. Boletín Oficial del Estado, 154, de 1 de junio de 2020.</w:t>
+      </w:r>
+    </w:p>
+    <w:p>
+      <w:pPr>
+        <w:spacing w:after="80"/>
+        <w:ind w:left="360" w:hanging="360"/>
+      </w:pPr>
+      <w:r>
+        <w:t>Ley 19/2021, de 20 de diciembre, por la que se establece el ingreso mínimo vital. Boletín Oficial del Estado, 304, de 21 de diciembre de 2021.</w:t>
+      </w:r>
+    </w:p>
+    <w:p>
+      <w:pPr>
+        <w:spacing w:after="80"/>
+        <w:ind w:left="360" w:hanging="360"/>
+      </w:pPr>
+      <w:r>
+        <w:t>Real Decreto 789/2022, de 27 de septiembre, por el que se regula la compatibilidad del Ingreso Mínimo Vital con los ingresos procedentes de rentas del trabajo o de la actividad económica por cuenta propia.</w:t>
+      </w:r>
+    </w:p>
+    <w:p>
+      <w:pPr>
+        <w:spacing w:after="80"/>
+        <w:ind w:left="360" w:hanging="360"/>
+      </w:pPr>
+      <w:r>
+        <w:t>Ley 3/2023, de 28 de febrero, de Empleo. Boletín Oficial del Estado, 51, de 1 de marzo de 2023.</w:t>
+      </w:r>
+    </w:p>
+    <w:p>
+      <w:pPr>
+        <w:spacing w:after="80"/>
+        <w:ind w:left="360" w:hanging="360"/>
+      </w:pPr>
+      <w:r>
+        <w:t>Real Decreto-ley 2/2024, de 21 de mayo, por el que se adoptan medidas urgentes para la simplificación y mejora del nivel asistencial de la protección por desempleo. Boletín Oficial del Estado, 124, de 22 de mayo de 2024.</w:t>
+      </w:r>
+    </w:p>
+    <w:p>
+      <w:pPr>
+        <w:spacing w:after="80"/>
+        <w:ind w:left="360" w:hanging="360"/>
+      </w:pPr>
+      <w:r>
+        <w:t>Real Decreto 438/2024, de 30 de abril, por el que se desarrollan la Cartera Común de Servicios del Sistema Nacional de Empleo y los servicios garantizados. Boletín Oficial del Estado, 106, de 2 de mayo de 2024.</w:t>
+      </w:r>
+    </w:p>
+    <w:p>
+      <w:pPr>
+        <w:spacing w:after="80"/>
+        <w:ind w:left="360" w:hanging="360"/>
+      </w:pPr>
+      <w:r>
+        <w:t>Real Decreto-ley 3/2026, de 3 de febrero, para la revalorización de las pensiones públicas y otras medidas urgentes en materia de Seguridad Social.</w:t>
+      </w:r>
+    </w:p>
+    <w:p>
+      <w:pPr>
+        <w:spacing w:after="80"/>
+        <w:ind w:left="360" w:hanging="360"/>
+      </w:pPr>
+      <w:r>
+        <w:t>Real Decreto 240/2026, de 25 de marzo, por el que se modifica el Real Decreto 789/2022, de 27 de septiembre.</w:t>
+      </w:r>
     </w:p>
     <w:sectPr>
       <w:pgSz w:w="11906" w:h="16838"/>

</xml_diff>